<commit_message>
nx Task 7 AirPlane
</commit_message>
<xml_diff>
--- a/sem7/NX/Пособия/Лабораторные задания_ПС.docx
+++ b/sem7/NX/Пособия/Лабораторные задания_ПС.docx
@@ -2486,21 +2486,7 @@
         <w:rPr>
           <w:color w:val="000000"/>
         </w:rPr>
-        <w:t xml:space="preserve">Второй, </w:t>
-      </w:r>
-      <w:proofErr w:type="gramStart"/>
-      <w:r>
-        <w:rPr>
-          <w:color w:val="000000"/>
-        </w:rPr>
-        <w:t>похожий  эскиз</w:t>
-      </w:r>
-      <w:proofErr w:type="gramEnd"/>
-      <w:r>
-        <w:rPr>
-          <w:color w:val="000000"/>
-        </w:rPr>
-        <w:t xml:space="preserve"> нужно  расположить в плоскости, перпендикулярной первому эскизу. Постарайтесь   соответственным образом ориентировать второй эскиз.</w:t>
+        <w:t>Второй, похожий  эскиз нужно  расположить в плоскости, перпендикулярной первому эскизу. Постарайтесь   соответственным образом ориентировать второй эскиз.</w:t>
       </w:r>
     </w:p>
     <w:p>
@@ -2526,21 +2512,7 @@
         <w:rPr>
           <w:color w:val="000000"/>
         </w:rPr>
-        <w:t xml:space="preserve">Если параметры эскизов одинаковы, то в </w:t>
-      </w:r>
-      <w:proofErr w:type="gramStart"/>
-      <w:r>
-        <w:rPr>
-          <w:color w:val="000000"/>
-        </w:rPr>
-        <w:t>результате  формообразования</w:t>
-      </w:r>
-      <w:proofErr w:type="gramEnd"/>
-      <w:r>
-        <w:rPr>
-          <w:color w:val="000000"/>
-        </w:rPr>
-        <w:t xml:space="preserve"> (</w:t>
+        <w:t>Если параметры эскизов одинаковы, то в результате  формообразования (</w:t>
       </w:r>
       <w:r>
         <w:rPr>
@@ -2568,7 +2540,6 @@
         </w:rPr>
         <w:t xml:space="preserve"> вы получите деталь как на рис. 3.  В случае   булевой операции </w:t>
       </w:r>
-      <w:proofErr w:type="gramStart"/>
       <w:r>
         <w:rPr>
           <w:i/>
@@ -2580,28 +2551,7 @@
         <w:rPr>
           <w:color w:val="000000"/>
         </w:rPr>
-        <w:t xml:space="preserve"> деталь</w:t>
-      </w:r>
-      <w:proofErr w:type="gramEnd"/>
-      <w:r>
-        <w:rPr>
-          <w:color w:val="000000"/>
-        </w:rPr>
-        <w:t xml:space="preserve"> примет форму как на рис.4. Для отладки </w:t>
-      </w:r>
-      <w:proofErr w:type="gramStart"/>
-      <w:r>
-        <w:rPr>
-          <w:color w:val="000000"/>
-        </w:rPr>
-        <w:t>проекта  рекомендуется</w:t>
-      </w:r>
-      <w:proofErr w:type="gramEnd"/>
-      <w:r>
-        <w:rPr>
-          <w:color w:val="000000"/>
-        </w:rPr>
-        <w:t xml:space="preserve"> установить булеву операцию </w:t>
+        <w:t xml:space="preserve"> деталь примет форму как на рис.4. Для отладки проекта  рекомендуется установить булеву операцию </w:t>
       </w:r>
       <w:r>
         <w:rPr>
@@ -3187,21 +3137,7 @@
           <w:color w:val="000000"/>
         </w:rPr>
         <w:lastRenderedPageBreak/>
-        <w:t xml:space="preserve">Подготовительный этап, во </w:t>
-      </w:r>
-      <w:proofErr w:type="gramStart"/>
-      <w:r>
-        <w:rPr>
-          <w:color w:val="000000"/>
-        </w:rPr>
-        <w:t>время  которого</w:t>
-      </w:r>
-      <w:proofErr w:type="gramEnd"/>
-      <w:r>
-        <w:rPr>
-          <w:color w:val="000000"/>
-        </w:rPr>
-        <w:t xml:space="preserve"> строятся вспомогательные точки, линии, сплайны, профили. И нужно сказать, что этот этап работы – самый трудоемкий.</w:t>
+        <w:t>Подготовительный этап, во время  которого строятся вспомогательные точки, линии, сплайны, профили. И нужно сказать, что этот этап работы – самый трудоемкий.</w:t>
       </w:r>
     </w:p>
     <w:p>
@@ -3466,28 +3402,13 @@
           <w:b/>
           <w:color w:val="000000"/>
         </w:rPr>
-        <w:t xml:space="preserve">П Р И М Е Ч А Н И </w:t>
-      </w:r>
-      <w:proofErr w:type="gramStart"/>
-      <w:r>
-        <w:rPr>
-          <w:b/>
-          <w:color w:val="000000"/>
-        </w:rPr>
-        <w:t>Е</w:t>
-      </w:r>
-      <w:r>
-        <w:rPr>
-          <w:color w:val="000000"/>
-        </w:rPr>
-        <w:t xml:space="preserve"> :</w:t>
-      </w:r>
-      <w:proofErr w:type="gramEnd"/>
-      <w:r>
-        <w:rPr>
-          <w:color w:val="000000"/>
-        </w:rPr>
-        <w:t xml:space="preserve"> здесь и далее в каждом задании нумерация рисунков всегда начинается с единицы.</w:t>
+        <w:t>П Р И М Е Ч А Н И Е</w:t>
+      </w:r>
+      <w:r>
+        <w:rPr>
+          <w:color w:val="000000"/>
+        </w:rPr>
+        <w:t xml:space="preserve"> : здесь и далее в каждом задании нумерация рисунков всегда начинается с единицы.</w:t>
       </w:r>
     </w:p>
     <w:p>
@@ -3557,72 +3478,31 @@
         </w:rPr>
         <w:t xml:space="preserve">В качестве исходных данных из директории </w:t>
       </w:r>
-      <w:proofErr w:type="spellStart"/>
       <w:r>
         <w:rPr>
           <w:i/>
           <w:color w:val="000000"/>
         </w:rPr>
-        <w:t>Mat_Displ_Zala</w:t>
-      </w:r>
-      <w:proofErr w:type="spellEnd"/>
-      <w:r>
-        <w:rPr>
-          <w:i/>
-          <w:color w:val="000000"/>
-        </w:rPr>
-        <w:t xml:space="preserve"> \ </w:t>
-      </w:r>
-      <w:proofErr w:type="spellStart"/>
-      <w:r>
-        <w:rPr>
-          <w:i/>
-          <w:color w:val="000000"/>
-        </w:rPr>
-        <w:t>Prim</w:t>
-      </w:r>
-      <w:proofErr w:type="spellEnd"/>
+        <w:t>Mat_Displ_Zala \ Prim</w:t>
+      </w:r>
       <w:r>
         <w:rPr>
           <w:color w:val="000000"/>
         </w:rPr>
         <w:t xml:space="preserve"> загрузите файл </w:t>
       </w:r>
-      <w:proofErr w:type="spellStart"/>
       <w:r>
         <w:rPr>
           <w:b/>
           <w:color w:val="000000"/>
         </w:rPr>
-        <w:t>Fonar_Isch.PRT</w:t>
-      </w:r>
-      <w:proofErr w:type="spellEnd"/>
-      <w:r>
-        <w:rPr>
-          <w:b/>
-          <w:color w:val="000000"/>
-        </w:rPr>
-        <w:t xml:space="preserve">. </w:t>
-      </w:r>
-      <w:r>
-        <w:rPr>
-          <w:color w:val="000000"/>
-        </w:rPr>
-        <w:t xml:space="preserve">В навигаторе </w:t>
-      </w:r>
-      <w:proofErr w:type="gramStart"/>
-      <w:r>
-        <w:rPr>
-          <w:color w:val="000000"/>
-        </w:rPr>
-        <w:t>детали  этого</w:t>
-      </w:r>
-      <w:proofErr w:type="gramEnd"/>
-      <w:r>
-        <w:rPr>
-          <w:color w:val="000000"/>
-        </w:rPr>
-        <w:t xml:space="preserve"> файла присутствуют только строки исходных кривых (рис.2).</w:t>
+        <w:t xml:space="preserve">Fonar_Isch.PRT. </w:t>
+      </w:r>
+      <w:r>
+        <w:rPr>
+          <w:color w:val="000000"/>
+        </w:rPr>
+        <w:t>В навигаторе детали  этого файла присутствуют только строки исходных кривых (рис.2).</w:t>
       </w:r>
     </w:p>
     <w:p>
@@ -3644,19 +3524,11 @@
           <w:color w:val="000000"/>
         </w:rPr>
       </w:pPr>
-      <w:proofErr w:type="gramStart"/>
-      <w:r>
-        <w:rPr>
-          <w:color w:val="000000"/>
-        </w:rPr>
-        <w:t>Выберите  сплайн</w:t>
-      </w:r>
-      <w:proofErr w:type="gramEnd"/>
-      <w:r>
-        <w:rPr>
-          <w:color w:val="000000"/>
-        </w:rPr>
-        <w:t xml:space="preserve">  «</w:t>
+      <w:r>
+        <w:rPr>
+          <w:color w:val="000000"/>
+        </w:rPr>
+        <w:t>Выберите  сплайн  «</w:t>
       </w:r>
       <w:r>
         <w:rPr>
@@ -3938,21 +3810,7 @@
         <w:rPr>
           <w:color w:val="000000"/>
         </w:rPr>
-        <w:t xml:space="preserve">Выберите </w:t>
-      </w:r>
-      <w:proofErr w:type="gramStart"/>
-      <w:r>
-        <w:rPr>
-          <w:color w:val="000000"/>
-        </w:rPr>
-        <w:t>сплайн  «</w:t>
-      </w:r>
-      <w:proofErr w:type="gramEnd"/>
-      <w:r>
-        <w:rPr>
-          <w:color w:val="000000"/>
-        </w:rPr>
-        <w:t xml:space="preserve">Кривая протягивания» в качестве образующего профиля, «Кривая вращения» в качестве направляющего профиля и выполните над ними операцию </w:t>
+        <w:t xml:space="preserve">Выберите сплайн  «Кривая протягивания» в качестве образующего профиля, «Кривая вращения» в качестве направляющего профиля и выполните над ними операцию </w:t>
       </w:r>
       <w:r>
         <w:rPr>
@@ -4818,15 +4676,7 @@
           <w:i/>
           <w:color w:val="000000"/>
         </w:rPr>
-        <w:t xml:space="preserve">Вставить \ Элементы проектирования \ </w:t>
-      </w:r>
-      <w:proofErr w:type="gramStart"/>
-      <w:r>
-        <w:rPr>
-          <w:i/>
-          <w:color w:val="000000"/>
-        </w:rPr>
-        <w:t>Вытягивание</w:t>
+        <w:t>Вставить \ Элементы проектирования \ Вытягивание</w:t>
       </w:r>
       <w:r>
         <w:rPr>
@@ -4839,14 +4689,7 @@
         <w:rPr>
           <w:color w:val="000000"/>
         </w:rPr>
-        <w:t>)</w:t>
-      </w:r>
-      <w:proofErr w:type="gramEnd"/>
-      <w:r>
-        <w:rPr>
-          <w:color w:val="000000"/>
-        </w:rPr>
-        <w:t xml:space="preserve"> вдоль оси X в обе стороны на расстояния 64 мм.  </w:t>
+        <w:t xml:space="preserve">) вдоль оси X в обе стороны на расстояния 64 мм.  </w:t>
       </w:r>
     </w:p>
     <w:p>
@@ -5325,21 +5168,7 @@
         <w:rPr>
           <w:color w:val="000000"/>
         </w:rPr>
-        <w:t xml:space="preserve">Опять </w:t>
-      </w:r>
-      <w:proofErr w:type="gramStart"/>
-      <w:r>
-        <w:rPr>
-          <w:color w:val="000000"/>
-        </w:rPr>
-        <w:t>сшейте  обе</w:t>
-      </w:r>
-      <w:proofErr w:type="gramEnd"/>
-      <w:r>
-        <w:rPr>
-          <w:color w:val="000000"/>
-        </w:rPr>
-        <w:t xml:space="preserve"> поверхности командой </w:t>
+        <w:t xml:space="preserve">Опять сшейте  обе поверхности командой </w:t>
       </w:r>
       <w:r>
         <w:rPr>
@@ -5385,28 +5214,13 @@
           <w:i/>
           <w:color w:val="000000"/>
         </w:rPr>
-        <w:t xml:space="preserve">Кривая для </w:t>
-      </w:r>
-      <w:proofErr w:type="gramStart"/>
-      <w:r>
-        <w:rPr>
-          <w:i/>
-          <w:color w:val="000000"/>
-        </w:rPr>
-        <w:t>пальцев</w:t>
-      </w:r>
-      <w:r>
-        <w:rPr>
-          <w:color w:val="000000"/>
-        </w:rPr>
-        <w:t>»  вдоль</w:t>
-      </w:r>
-      <w:proofErr w:type="gramEnd"/>
-      <w:r>
-        <w:rPr>
-          <w:color w:val="000000"/>
-        </w:rPr>
-        <w:t xml:space="preserve"> оси Z на 64 мм в обе стороны. </w:t>
+        <w:t>Кривая для пальцев</w:t>
+      </w:r>
+      <w:r>
+        <w:rPr>
+          <w:color w:val="000000"/>
+        </w:rPr>
+        <w:t xml:space="preserve">»  вдоль оси Z на 64 мм в обе стороны. </w:t>
       </w:r>
     </w:p>
     <w:p>
@@ -5731,21 +5545,7 @@
         <w:rPr>
           <w:color w:val="000000"/>
         </w:rPr>
-        <w:t xml:space="preserve">Опять </w:t>
-      </w:r>
-      <w:proofErr w:type="gramStart"/>
-      <w:r>
-        <w:rPr>
-          <w:color w:val="000000"/>
-        </w:rPr>
-        <w:t>сшейте  все</w:t>
-      </w:r>
-      <w:proofErr w:type="gramEnd"/>
-      <w:r>
-        <w:rPr>
-          <w:color w:val="000000"/>
-        </w:rPr>
-        <w:t xml:space="preserve"> поверхности командой </w:t>
+        <w:t xml:space="preserve">Опять сшейте  все поверхности командой </w:t>
       </w:r>
       <w:r>
         <w:rPr>
@@ -5876,21 +5676,7 @@
         <w:rPr>
           <w:color w:val="000000"/>
         </w:rPr>
-        <w:t xml:space="preserve">Опять </w:t>
-      </w:r>
-      <w:proofErr w:type="gramStart"/>
-      <w:r>
-        <w:rPr>
-          <w:color w:val="000000"/>
-        </w:rPr>
-        <w:t>сшейте  все</w:t>
-      </w:r>
-      <w:proofErr w:type="gramEnd"/>
-      <w:r>
-        <w:rPr>
-          <w:color w:val="000000"/>
-        </w:rPr>
-        <w:t xml:space="preserve"> поверхности командой </w:t>
+        <w:t xml:space="preserve">Опять сшейте  все поверхности командой </w:t>
       </w:r>
       <w:r>
         <w:rPr>
@@ -6384,23 +6170,53 @@
           <w:b/>
           <w:color w:val="000000"/>
         </w:rPr>
-        <w:t xml:space="preserve">Точка </w:t>
-      </w:r>
-      <w:proofErr w:type="gramStart"/>
+        <w:t>Точка 1:    0,0,5</w:t>
+      </w:r>
+    </w:p>
+    <w:p>
+      <w:pPr>
+        <w:pBdr>
+          <w:top w:val="nil"/>
+          <w:left w:val="nil"/>
+          <w:bottom w:val="nil"/>
+          <w:right w:val="nil"/>
+          <w:between w:val="nil"/>
+        </w:pBdr>
+        <w:spacing w:line="240" w:lineRule="auto"/>
+        <w:ind w:left="0" w:hanging="2"/>
+        <w:rPr>
+          <w:color w:val="000000"/>
+        </w:rPr>
+      </w:pPr>
       <w:r>
         <w:rPr>
           <w:b/>
           <w:color w:val="000000"/>
         </w:rPr>
-        <w:t xml:space="preserve">1:   </w:t>
-      </w:r>
-      <w:proofErr w:type="gramEnd"/>
+        <w:t>Точка 2:    0,10,9</w:t>
+      </w:r>
+    </w:p>
+    <w:p>
+      <w:pPr>
+        <w:pBdr>
+          <w:top w:val="nil"/>
+          <w:left w:val="nil"/>
+          <w:bottom w:val="nil"/>
+          <w:right w:val="nil"/>
+          <w:between w:val="nil"/>
+        </w:pBdr>
+        <w:spacing w:line="240" w:lineRule="auto"/>
+        <w:ind w:left="0" w:hanging="2"/>
+        <w:rPr>
+          <w:color w:val="000000"/>
+        </w:rPr>
+      </w:pPr>
       <w:r>
         <w:rPr>
           <w:b/>
           <w:color w:val="000000"/>
         </w:rPr>
-        <w:t xml:space="preserve"> 0,0,5</w:t>
+        <w:t>Точка 3:    0,23,7</w:t>
       </w:r>
     </w:p>
     <w:p>
@@ -6423,140 +6239,30 @@
           <w:b/>
           <w:color w:val="000000"/>
         </w:rPr>
-        <w:t xml:space="preserve">Точка </w:t>
-      </w:r>
-      <w:proofErr w:type="gramStart"/>
+        <w:t>Точка 4:    0,30,8</w:t>
+      </w:r>
+    </w:p>
+    <w:p>
+      <w:pPr>
+        <w:pBdr>
+          <w:top w:val="nil"/>
+          <w:left w:val="nil"/>
+          <w:bottom w:val="nil"/>
+          <w:right w:val="nil"/>
+          <w:between w:val="nil"/>
+        </w:pBdr>
+        <w:spacing w:line="240" w:lineRule="auto"/>
+        <w:ind w:left="0" w:hanging="2"/>
+        <w:rPr>
+          <w:color w:val="000000"/>
+        </w:rPr>
+      </w:pPr>
       <w:r>
         <w:rPr>
           <w:b/>
           <w:color w:val="000000"/>
         </w:rPr>
-        <w:t xml:space="preserve">2:   </w:t>
-      </w:r>
-      <w:proofErr w:type="gramEnd"/>
-      <w:r>
-        <w:rPr>
-          <w:b/>
-          <w:color w:val="000000"/>
-        </w:rPr>
-        <w:t xml:space="preserve"> 0,10,9</w:t>
-      </w:r>
-    </w:p>
-    <w:p>
-      <w:pPr>
-        <w:pBdr>
-          <w:top w:val="nil"/>
-          <w:left w:val="nil"/>
-          <w:bottom w:val="nil"/>
-          <w:right w:val="nil"/>
-          <w:between w:val="nil"/>
-        </w:pBdr>
-        <w:spacing w:line="240" w:lineRule="auto"/>
-        <w:ind w:left="0" w:hanging="2"/>
-        <w:rPr>
-          <w:color w:val="000000"/>
-        </w:rPr>
-      </w:pPr>
-      <w:r>
-        <w:rPr>
-          <w:b/>
-          <w:color w:val="000000"/>
-        </w:rPr>
-        <w:t xml:space="preserve">Точка </w:t>
-      </w:r>
-      <w:proofErr w:type="gramStart"/>
-      <w:r>
-        <w:rPr>
-          <w:b/>
-          <w:color w:val="000000"/>
-        </w:rPr>
-        <w:t xml:space="preserve">3:   </w:t>
-      </w:r>
-      <w:proofErr w:type="gramEnd"/>
-      <w:r>
-        <w:rPr>
-          <w:b/>
-          <w:color w:val="000000"/>
-        </w:rPr>
-        <w:t xml:space="preserve"> 0,23,7</w:t>
-      </w:r>
-    </w:p>
-    <w:p>
-      <w:pPr>
-        <w:pBdr>
-          <w:top w:val="nil"/>
-          <w:left w:val="nil"/>
-          <w:bottom w:val="nil"/>
-          <w:right w:val="nil"/>
-          <w:between w:val="nil"/>
-        </w:pBdr>
-        <w:spacing w:line="240" w:lineRule="auto"/>
-        <w:ind w:left="0" w:hanging="2"/>
-        <w:rPr>
-          <w:color w:val="000000"/>
-        </w:rPr>
-      </w:pPr>
-      <w:r>
-        <w:rPr>
-          <w:b/>
-          <w:color w:val="000000"/>
-        </w:rPr>
-        <w:t xml:space="preserve">Точка </w:t>
-      </w:r>
-      <w:proofErr w:type="gramStart"/>
-      <w:r>
-        <w:rPr>
-          <w:b/>
-          <w:color w:val="000000"/>
-        </w:rPr>
-        <w:t xml:space="preserve">4:   </w:t>
-      </w:r>
-      <w:proofErr w:type="gramEnd"/>
-      <w:r>
-        <w:rPr>
-          <w:b/>
-          <w:color w:val="000000"/>
-        </w:rPr>
-        <w:t xml:space="preserve"> 0,30,8</w:t>
-      </w:r>
-    </w:p>
-    <w:p>
-      <w:pPr>
-        <w:pBdr>
-          <w:top w:val="nil"/>
-          <w:left w:val="nil"/>
-          <w:bottom w:val="nil"/>
-          <w:right w:val="nil"/>
-          <w:between w:val="nil"/>
-        </w:pBdr>
-        <w:spacing w:line="240" w:lineRule="auto"/>
-        <w:ind w:left="0" w:hanging="2"/>
-        <w:rPr>
-          <w:color w:val="000000"/>
-        </w:rPr>
-      </w:pPr>
-      <w:r>
-        <w:rPr>
-          <w:b/>
-          <w:color w:val="000000"/>
-        </w:rPr>
-        <w:t xml:space="preserve">Точка </w:t>
-      </w:r>
-      <w:proofErr w:type="gramStart"/>
-      <w:r>
-        <w:rPr>
-          <w:b/>
-          <w:color w:val="000000"/>
-        </w:rPr>
-        <w:t xml:space="preserve">5:   </w:t>
-      </w:r>
-      <w:proofErr w:type="gramEnd"/>
-      <w:r>
-        <w:rPr>
-          <w:b/>
-          <w:color w:val="000000"/>
-        </w:rPr>
-        <w:t xml:space="preserve"> -20,30,7</w:t>
+        <w:t>Точка 5:    -20,30,7</w:t>
       </w:r>
     </w:p>
     <w:p>
@@ -6621,21 +6327,7 @@
         <w:rPr>
           <w:color w:val="000000"/>
         </w:rPr>
-        <w:t xml:space="preserve">По двум последним точкам </w:t>
-      </w:r>
-      <w:proofErr w:type="gramStart"/>
-      <w:r>
-        <w:rPr>
-          <w:color w:val="000000"/>
-        </w:rPr>
-        <w:t>( 4</w:t>
-      </w:r>
-      <w:proofErr w:type="gramEnd"/>
-      <w:r>
-        <w:rPr>
-          <w:color w:val="000000"/>
-        </w:rPr>
-        <w:t xml:space="preserve"> и 5) построим </w:t>
+        <w:t xml:space="preserve">По двум последним точкам ( 4 и 5) построим </w:t>
       </w:r>
       <w:r>
         <w:rPr>
@@ -6923,7 +6615,6 @@
         </w:rPr>
         <w:t xml:space="preserve"> В плоскости XOY построим </w:t>
       </w:r>
-      <w:proofErr w:type="gramStart"/>
       <w:r>
         <w:rPr>
           <w:b/>
@@ -6935,14 +6626,7 @@
         <w:rPr>
           <w:color w:val="000000"/>
         </w:rPr>
-        <w:t xml:space="preserve"> (</w:t>
-      </w:r>
-      <w:proofErr w:type="gramEnd"/>
-      <w:r>
-        <w:rPr>
-          <w:color w:val="000000"/>
-        </w:rPr>
-        <w:t xml:space="preserve">рис.2). </w:t>
+        <w:t xml:space="preserve"> (рис.2). </w:t>
       </w:r>
     </w:p>
     <w:p>
@@ -6990,16 +6674,8 @@
         <w:rPr>
           <w:color w:val="000000"/>
         </w:rPr>
-        <w:t xml:space="preserve">Верхняя точка прямой линии эскиза должна совпадать с пятой, ранее построенной </w:t>
-      </w:r>
-      <w:proofErr w:type="gramStart"/>
-      <w:r>
-        <w:rPr>
-          <w:color w:val="000000"/>
-        </w:rPr>
-        <w:t>пространственной  точкой</w:t>
-      </w:r>
-      <w:proofErr w:type="gramEnd"/>
+        <w:t>Верхняя точка прямой линии эскиза должна совпадать с пятой, ранее построенной пространственной  точкой</w:t>
+      </w:r>
     </w:p>
     <w:p>
       <w:pPr>
@@ -7024,16 +6700,8 @@
         <w:rPr>
           <w:color w:val="000000"/>
         </w:rPr>
-        <w:t xml:space="preserve">Свободный конец дуги должен совпадать с первой, ранее построенной </w:t>
-      </w:r>
-      <w:proofErr w:type="gramStart"/>
-      <w:r>
-        <w:rPr>
-          <w:color w:val="000000"/>
-        </w:rPr>
-        <w:t>пространственной  точкой</w:t>
-      </w:r>
-      <w:proofErr w:type="gramEnd"/>
+        <w:t>Свободный конец дуги должен совпадать с первой, ранее построенной пространственной  точкой</w:t>
+      </w:r>
     </w:p>
     <w:p>
       <w:pPr>
@@ -7102,29 +6770,14 @@
         <w:rPr>
           <w:color w:val="000000"/>
         </w:rPr>
-        <w:t xml:space="preserve">Выполните </w:t>
-      </w:r>
-      <w:proofErr w:type="gramStart"/>
-      <w:r>
-        <w:rPr>
-          <w:color w:val="000000"/>
-        </w:rPr>
-        <w:t xml:space="preserve">операцию </w:t>
+        <w:t xml:space="preserve">Выполните операцию </w:t>
       </w:r>
       <w:r>
         <w:rPr>
           <w:i/>
           <w:color w:val="000000"/>
         </w:rPr>
-        <w:t>Вставить</w:t>
-      </w:r>
-      <w:proofErr w:type="gramEnd"/>
-      <w:r>
-        <w:rPr>
-          <w:i/>
-          <w:color w:val="000000"/>
-        </w:rPr>
-        <w:t xml:space="preserve"> \ Элементы проектирования \ Вытягивание</w:t>
+        <w:t>Вставить \ Элементы проектирования \ Вытягивание</w:t>
       </w:r>
       <w:r>
         <w:rPr>
@@ -7418,29 +7071,14 @@
         <w:rPr>
           <w:color w:val="000000"/>
         </w:rPr>
-        <w:t xml:space="preserve">Выполните </w:t>
-      </w:r>
-      <w:proofErr w:type="gramStart"/>
-      <w:r>
-        <w:rPr>
-          <w:color w:val="000000"/>
-        </w:rPr>
-        <w:t xml:space="preserve">операцию  </w:t>
+        <w:t xml:space="preserve">Выполните операцию  </w:t>
       </w:r>
       <w:r>
         <w:rPr>
           <w:i/>
           <w:color w:val="000000"/>
         </w:rPr>
-        <w:t>Вставить</w:t>
-      </w:r>
-      <w:proofErr w:type="gramEnd"/>
-      <w:r>
-        <w:rPr>
-          <w:i/>
-          <w:color w:val="000000"/>
-        </w:rPr>
-        <w:t xml:space="preserve"> \ Элементы проектирования \ Вытягивание</w:t>
+        <w:t>Вставить \ Элементы проектирования \ Вытягивание</w:t>
       </w:r>
       <w:r>
         <w:rPr>
@@ -7554,7 +7192,6 @@
         </w:rPr>
         <w:t xml:space="preserve">В плоскости XOY строим несложный </w:t>
       </w:r>
-      <w:proofErr w:type="gramStart"/>
       <w:r>
         <w:rPr>
           <w:b/>
@@ -7562,7 +7199,6 @@
         </w:rPr>
         <w:t>эскиз  2</w:t>
       </w:r>
-      <w:proofErr w:type="gramEnd"/>
       <w:r>
         <w:rPr>
           <w:color w:val="000000"/>
@@ -7869,23 +7505,13 @@
         </w:rPr>
         <w:t xml:space="preserve">Теперь рассечем </w:t>
       </w:r>
-      <w:proofErr w:type="gramStart"/>
       <w:r>
         <w:rPr>
           <w:b/>
           <w:i/>
           <w:color w:val="000000"/>
         </w:rPr>
-        <w:t>твердое  тело</w:t>
-      </w:r>
-      <w:proofErr w:type="gramEnd"/>
-      <w:r>
-        <w:rPr>
-          <w:b/>
-          <w:i/>
-          <w:color w:val="000000"/>
-        </w:rPr>
-        <w:t xml:space="preserve"> вытягивания 1</w:t>
+        <w:t>твердое  тело вытягивания 1</w:t>
       </w:r>
       <w:r>
         <w:rPr>
@@ -7990,21 +7616,7 @@
         <w:rPr>
           <w:color w:val="000000"/>
         </w:rPr>
-        <w:t xml:space="preserve">Протянем этот эскиз вдоль </w:t>
-      </w:r>
-      <w:proofErr w:type="gramStart"/>
-      <w:r>
-        <w:rPr>
-          <w:color w:val="000000"/>
-        </w:rPr>
-        <w:t>оси  X</w:t>
-      </w:r>
-      <w:proofErr w:type="gramEnd"/>
-      <w:r>
-        <w:rPr>
-          <w:color w:val="000000"/>
-        </w:rPr>
-        <w:t xml:space="preserve"> до пересечения с поверхностью </w:t>
+        <w:t xml:space="preserve">Протянем этот эскиз вдоль оси  X до пересечения с поверхностью </w:t>
       </w:r>
       <w:r>
         <w:rPr>
@@ -8263,21 +7875,7 @@
         <w:rPr>
           <w:color w:val="000000"/>
         </w:rPr>
-        <w:t xml:space="preserve"> (радиус скругления 1.5 мм), </w:t>
-      </w:r>
-      <w:proofErr w:type="gramStart"/>
-      <w:r>
-        <w:rPr>
-          <w:color w:val="000000"/>
-        </w:rPr>
-        <w:t>чтобы  получить</w:t>
-      </w:r>
-      <w:proofErr w:type="gramEnd"/>
-      <w:r>
-        <w:rPr>
-          <w:color w:val="000000"/>
-        </w:rPr>
-        <w:t xml:space="preserve"> итоговую форму нашей кнопки (рис.12,13).</w:t>
+        <w:t xml:space="preserve"> (радиус скругления 1.5 мм), чтобы  получить итоговую форму нашей кнопки (рис.12,13).</w:t>
       </w:r>
     </w:p>
     <w:p>
@@ -8692,19 +8290,11 @@
           <w:color w:val="000000"/>
         </w:rPr>
       </w:pPr>
-      <w:proofErr w:type="gramStart"/>
-      <w:r>
-        <w:rPr>
-          <w:color w:val="000000"/>
-        </w:rPr>
-        <w:t>Устанавливаем  в</w:t>
-      </w:r>
-      <w:proofErr w:type="gramEnd"/>
-      <w:r>
-        <w:rPr>
-          <w:color w:val="000000"/>
-        </w:rPr>
-        <w:t xml:space="preserve"> пространстве пять точек:</w:t>
+      <w:r>
+        <w:rPr>
+          <w:color w:val="000000"/>
+        </w:rPr>
+        <w:t>Устанавливаем  в пространстве пять точек:</w:t>
       </w:r>
     </w:p>
     <w:p>
@@ -9156,14 +8746,12 @@
         </w:rPr>
         <w:t xml:space="preserve">После этого система спросит – как именно вы хотите построить свой сплайн (рис.5). Нужно выбрать </w:t>
       </w:r>
-      <w:proofErr w:type="gramStart"/>
       <w:r>
         <w:rPr>
           <w:color w:val="000000"/>
         </w:rPr>
         <w:t>опцию</w:t>
       </w:r>
-      <w:proofErr w:type="gramEnd"/>
       <w:r>
         <w:rPr>
           <w:color w:val="000000"/>
@@ -9931,21 +9519,7 @@
         <w:rPr>
           <w:color w:val="000000"/>
         </w:rPr>
-        <w:t xml:space="preserve">И только теперь в рабочем поле появится наша кривая. Такая длинная </w:t>
-      </w:r>
-      <w:proofErr w:type="gramStart"/>
-      <w:r>
-        <w:rPr>
-          <w:color w:val="000000"/>
-        </w:rPr>
-        <w:t>последовательность  действий</w:t>
-      </w:r>
-      <w:proofErr w:type="gramEnd"/>
-      <w:r>
-        <w:rPr>
-          <w:color w:val="000000"/>
-        </w:rPr>
-        <w:t xml:space="preserve"> объясняется тем, что команда </w:t>
+        <w:t xml:space="preserve">И только теперь в рабочем поле появится наша кривая. Такая длинная последовательность  действий объясняется тем, что команда </w:t>
       </w:r>
       <w:r>
         <w:rPr>
@@ -9958,21 +9532,7 @@
         <w:rPr>
           <w:color w:val="000000"/>
         </w:rPr>
-        <w:t xml:space="preserve">  довольно старая. В новых версиях </w:t>
-      </w:r>
-      <w:proofErr w:type="gramStart"/>
-      <w:r>
-        <w:rPr>
-          <w:color w:val="000000"/>
-        </w:rPr>
-        <w:t>системы  все</w:t>
-      </w:r>
-      <w:proofErr w:type="gramEnd"/>
-      <w:r>
-        <w:rPr>
-          <w:color w:val="000000"/>
-        </w:rPr>
-        <w:t xml:space="preserve">  происходит гораздо короче.</w:t>
+        <w:t xml:space="preserve">  довольно старая. В новых версиях системы  все  происходит гораздо короче.</w:t>
       </w:r>
     </w:p>
     <w:p>
@@ -10029,7 +9589,6 @@
         </w:rPr>
         <w:t xml:space="preserve"> с плоскостью </w:t>
       </w:r>
-      <w:proofErr w:type="spellStart"/>
       <w:r>
         <w:rPr>
           <w:b/>
@@ -10044,7 +9603,6 @@
         </w:rPr>
         <w:t>ц</w:t>
       </w:r>
-      <w:proofErr w:type="spellEnd"/>
       <w:r>
         <w:rPr>
           <w:b/>
@@ -10196,19 +9754,11 @@
           <w:color w:val="000000"/>
         </w:rPr>
       </w:pPr>
-      <w:proofErr w:type="gramStart"/>
-      <w:r>
-        <w:rPr>
-          <w:color w:val="000000"/>
-        </w:rPr>
-        <w:t>Устанавливаем  в</w:t>
-      </w:r>
-      <w:proofErr w:type="gramEnd"/>
-      <w:r>
-        <w:rPr>
-          <w:color w:val="000000"/>
-        </w:rPr>
-        <w:t xml:space="preserve"> пространстве еще шесть дополнительных точек:</w:t>
+      <w:r>
+        <w:rPr>
+          <w:color w:val="000000"/>
+        </w:rPr>
+        <w:t>Устанавливаем  в пространстве еще шесть дополнительных точек:</w:t>
       </w:r>
     </w:p>
     <w:p>
@@ -10381,19 +9931,11 @@
           <w:color w:val="000000"/>
         </w:rPr>
       </w:pPr>
-      <w:proofErr w:type="gramStart"/>
-      <w:r>
-        <w:rPr>
-          <w:color w:val="000000"/>
-        </w:rPr>
-        <w:t>и  строим</w:t>
-      </w:r>
-      <w:proofErr w:type="gramEnd"/>
-      <w:r>
-        <w:rPr>
-          <w:color w:val="000000"/>
-        </w:rPr>
-        <w:t xml:space="preserve"> по ним </w:t>
+      <w:r>
+        <w:rPr>
+          <w:color w:val="000000"/>
+        </w:rPr>
+        <w:t xml:space="preserve">и  строим по ним </w:t>
       </w:r>
       <w:r>
         <w:rPr>
@@ -10784,28 +10326,13 @@
           <w:b/>
           <w:color w:val="000000"/>
         </w:rPr>
-        <w:t xml:space="preserve">верхней </w:t>
-      </w:r>
-      <w:proofErr w:type="gramStart"/>
-      <w:r>
-        <w:rPr>
-          <w:b/>
-          <w:color w:val="000000"/>
-        </w:rPr>
-        <w:t>поверхности</w:t>
-      </w:r>
-      <w:r>
-        <w:rPr>
-          <w:color w:val="000000"/>
-        </w:rPr>
-        <w:t xml:space="preserve"> .</w:t>
-      </w:r>
-      <w:proofErr w:type="gramEnd"/>
-      <w:r>
-        <w:rPr>
-          <w:color w:val="000000"/>
-        </w:rPr>
-        <w:t xml:space="preserve"> При этом </w:t>
+        <w:t>верхней поверхности</w:t>
+      </w:r>
+      <w:r>
+        <w:rPr>
+          <w:color w:val="000000"/>
+        </w:rPr>
+        <w:t xml:space="preserve"> . При этом </w:t>
       </w:r>
       <w:r>
         <w:rPr>
@@ -11131,28 +10658,13 @@
           <w:b/>
           <w:color w:val="000000"/>
         </w:rPr>
-        <w:t xml:space="preserve">верхней </w:t>
-      </w:r>
-      <w:proofErr w:type="gramStart"/>
-      <w:r>
-        <w:rPr>
-          <w:b/>
-          <w:color w:val="000000"/>
-        </w:rPr>
-        <w:t>поверхности</w:t>
-      </w:r>
-      <w:r>
-        <w:rPr>
-          <w:color w:val="000000"/>
-        </w:rPr>
-        <w:t xml:space="preserve">  определена</w:t>
-      </w:r>
-      <w:proofErr w:type="gramEnd"/>
-      <w:r>
-        <w:rPr>
-          <w:color w:val="000000"/>
-        </w:rPr>
-        <w:t xml:space="preserve"> не местом расположения образующей дуги, а длиной направляющего сплайна.</w:t>
+        <w:t>верхней поверхности</w:t>
+      </w:r>
+      <w:r>
+        <w:rPr>
+          <w:color w:val="000000"/>
+        </w:rPr>
+        <w:t xml:space="preserve">  определена не местом расположения образующей дуги, а длиной направляющего сплайна.</w:t>
       </w:r>
     </w:p>
     <w:p>
@@ -11475,14 +10987,7 @@
           <w:color w:val="000000"/>
         </w:rPr>
         <w:lastRenderedPageBreak/>
-        <w:t xml:space="preserve">Нужное состояние </w:t>
-      </w:r>
-      <w:proofErr w:type="gramStart"/>
-      <w:r>
-        <w:rPr>
-          <w:color w:val="000000"/>
-        </w:rPr>
-        <w:t xml:space="preserve">поля  </w:t>
+        <w:t xml:space="preserve">Нужное состояние поля  </w:t>
       </w:r>
       <w:r>
         <w:rPr>
@@ -11491,7 +10996,6 @@
         </w:rPr>
         <w:t>Непрерывность</w:t>
       </w:r>
-      <w:proofErr w:type="gramEnd"/>
       <w:r>
         <w:rPr>
           <w:color w:val="000000"/>
@@ -11522,21 +11026,7 @@
         <w:rPr>
           <w:color w:val="000000"/>
         </w:rPr>
-        <w:t xml:space="preserve">Во время перечисления сечений нужно указать кромки сопрягаемых ленточек (рис.20). И для каждого нового сечения предварительно нужно нажимать на </w:t>
-      </w:r>
-      <w:proofErr w:type="gramStart"/>
-      <w:r>
-        <w:rPr>
-          <w:color w:val="000000"/>
-        </w:rPr>
-        <w:t>кнопочку</w:t>
-      </w:r>
-      <w:proofErr w:type="gramEnd"/>
-      <w:r>
-        <w:rPr>
-          <w:color w:val="000000"/>
-        </w:rPr>
-        <w:t xml:space="preserve"> </w:t>
+        <w:t xml:space="preserve">Во время перечисления сечений нужно указать кромки сопрягаемых ленточек (рис.20). И для каждого нового сечения предварительно нужно нажимать на кнопочку </w:t>
       </w:r>
       <w:r>
         <w:rPr>
@@ -11901,21 +11391,7 @@
         <w:rPr>
           <w:color w:val="000000"/>
         </w:rPr>
-        <w:t xml:space="preserve">В общем-то, вы уже построили все </w:t>
-      </w:r>
-      <w:proofErr w:type="gramStart"/>
-      <w:r>
-        <w:rPr>
-          <w:color w:val="000000"/>
-        </w:rPr>
-        <w:t>необходимые  поверхности</w:t>
-      </w:r>
-      <w:proofErr w:type="gramEnd"/>
-      <w:r>
-        <w:rPr>
-          <w:color w:val="000000"/>
-        </w:rPr>
-        <w:t xml:space="preserve"> (рис.22).</w:t>
+        <w:t>В общем-то, вы уже построили все необходимые  поверхности (рис.22).</w:t>
       </w:r>
     </w:p>
     <w:p>
@@ -12241,21 +11717,7 @@
         <w:rPr>
           <w:color w:val="000000"/>
         </w:rPr>
-        <w:t xml:space="preserve">Расширять верхнюю поверхность придется в обе стороны на 10 и 15 </w:t>
-      </w:r>
-      <w:proofErr w:type="gramStart"/>
-      <w:r>
-        <w:rPr>
-          <w:color w:val="000000"/>
-        </w:rPr>
-        <w:t>мм .</w:t>
-      </w:r>
-      <w:proofErr w:type="gramEnd"/>
-      <w:r>
-        <w:rPr>
-          <w:color w:val="000000"/>
-        </w:rPr>
-        <w:t xml:space="preserve"> Соответствующее состояние поля </w:t>
+        <w:t xml:space="preserve">Расширять верхнюю поверхность придется в обе стороны на 10 и 15 мм . Соответствующее состояние поля </w:t>
       </w:r>
       <w:r>
         <w:rPr>
@@ -12594,21 +12056,7 @@
         <w:rPr>
           <w:color w:val="000000"/>
         </w:rPr>
-        <w:t xml:space="preserve">. На самом деле, с помощью соответствующей </w:t>
-      </w:r>
-      <w:proofErr w:type="gramStart"/>
-      <w:r>
-        <w:rPr>
-          <w:color w:val="000000"/>
-        </w:rPr>
-        <w:t>опции,  мы</w:t>
-      </w:r>
-      <w:proofErr w:type="gramEnd"/>
-      <w:r>
-        <w:rPr>
-          <w:color w:val="000000"/>
-        </w:rPr>
-        <w:t xml:space="preserve"> выделим не тело, а грань (рис.27).</w:t>
+        <w:t>. На самом деле, с помощью соответствующей опции,  мы выделим не тело, а грань (рис.27).</w:t>
       </w:r>
     </w:p>
     <w:p>
@@ -12634,21 +12082,7 @@
         <w:rPr>
           <w:color w:val="000000"/>
         </w:rPr>
-        <w:t xml:space="preserve">В результате в навигаторе детали появятся две одинаковые </w:t>
-      </w:r>
-      <w:proofErr w:type="gramStart"/>
-      <w:r>
-        <w:rPr>
-          <w:color w:val="000000"/>
-        </w:rPr>
-        <w:t>строки  ИТОГОВАЯ</w:t>
-      </w:r>
-      <w:proofErr w:type="gramEnd"/>
-      <w:r>
-        <w:rPr>
-          <w:color w:val="000000"/>
-        </w:rPr>
-        <w:t xml:space="preserve"> ВЕРХНЯЯ ПОВЕРХНОСТЬ (рис.28). Но видимость одной из них мы на время выключим. </w:t>
+        <w:t xml:space="preserve">В результате в навигаторе детали появятся две одинаковые строки  ИТОГОВАЯ ВЕРХНЯЯ ПОВЕРХНОСТЬ (рис.28). Но видимость одной из них мы на время выключим. </w:t>
       </w:r>
     </w:p>
     <w:p>
@@ -12848,21 +12282,7 @@
         <w:rPr>
           <w:color w:val="000000"/>
         </w:rPr>
-        <w:t xml:space="preserve">Следующая операция – получение плавного сопряжения между двумя боковыми и пересекающимися </w:t>
-      </w:r>
-      <w:proofErr w:type="gramStart"/>
-      <w:r>
-        <w:rPr>
-          <w:color w:val="000000"/>
-        </w:rPr>
-        <w:t>поверхностями  вытягивания</w:t>
-      </w:r>
-      <w:proofErr w:type="gramEnd"/>
-      <w:r>
-        <w:rPr>
-          <w:color w:val="000000"/>
-        </w:rPr>
-        <w:t xml:space="preserve"> (рис.29). </w:t>
+        <w:t xml:space="preserve">Следующая операция – получение плавного сопряжения между двумя боковыми и пересекающимися поверхностями  вытягивания (рис.29). </w:t>
       </w:r>
     </w:p>
     <w:p>
@@ -12888,21 +12308,7 @@
         <w:rPr>
           <w:color w:val="000000"/>
         </w:rPr>
-        <w:t xml:space="preserve">Для этого вам </w:t>
-      </w:r>
-      <w:proofErr w:type="gramStart"/>
-      <w:r>
-        <w:rPr>
-          <w:color w:val="000000"/>
-        </w:rPr>
-        <w:t>придется  воспользоваться</w:t>
-      </w:r>
-      <w:proofErr w:type="gramEnd"/>
-      <w:r>
-        <w:rPr>
-          <w:color w:val="000000"/>
-        </w:rPr>
-        <w:t xml:space="preserve"> командой </w:t>
+        <w:t xml:space="preserve">Для этого вам придется  воспользоваться командой </w:t>
       </w:r>
       <w:r>
         <w:rPr>
@@ -12949,29 +12355,14 @@
         <w:rPr>
           <w:color w:val="000000"/>
         </w:rPr>
-        <w:t xml:space="preserve">Следующий </w:t>
-      </w:r>
-      <w:proofErr w:type="gramStart"/>
-      <w:r>
-        <w:rPr>
-          <w:color w:val="000000"/>
-        </w:rPr>
-        <w:t xml:space="preserve">шаг </w:t>
+        <w:t xml:space="preserve">Следующий шаг </w:t>
       </w:r>
       <w:r>
         <w:rPr>
           <w:i/>
           <w:color w:val="000000"/>
         </w:rPr>
-        <w:t>Вставить</w:t>
-      </w:r>
-      <w:proofErr w:type="gramEnd"/>
-      <w:r>
-        <w:rPr>
-          <w:i/>
-          <w:color w:val="000000"/>
-        </w:rPr>
-        <w:t xml:space="preserve"> \ Комбинировать \ Сшивка</w:t>
+        <w:t>Вставить \ Комбинировать \ Сшивка</w:t>
       </w:r>
       <w:r>
         <w:rPr>
@@ -13068,21 +12459,7 @@
         <w:rPr>
           <w:color w:val="000000"/>
         </w:rPr>
-        <w:t>Но снизу наша оболочка ещё не замкнута (рис.34</w:t>
-      </w:r>
-      <w:proofErr w:type="gramStart"/>
-      <w:r>
-        <w:rPr>
-          <w:color w:val="000000"/>
-        </w:rPr>
-        <w:t>) .</w:t>
-      </w:r>
-      <w:proofErr w:type="gramEnd"/>
-      <w:r>
-        <w:rPr>
-          <w:color w:val="000000"/>
-        </w:rPr>
-        <w:t xml:space="preserve"> Чтобы построить её днище, воспользуемся командой </w:t>
+        <w:t xml:space="preserve">Но снизу наша оболочка ещё не замкнута (рис.34) . Чтобы построить её днище, воспользуемся командой </w:t>
       </w:r>
       <w:r>
         <w:rPr>
@@ -15010,21 +14387,7 @@
         <w:rPr>
           <w:color w:val="000000"/>
         </w:rPr>
-        <w:t xml:space="preserve">Рассматриваемая здесь ситуация – довольно распространена в промышленном дизайне. Название «угол чемодана» условно. Речь идет о </w:t>
-      </w:r>
-      <w:proofErr w:type="spellStart"/>
-      <w:r>
-        <w:rPr>
-          <w:color w:val="000000"/>
-        </w:rPr>
-        <w:t>выглаживании</w:t>
-      </w:r>
-      <w:proofErr w:type="spellEnd"/>
-      <w:r>
-        <w:rPr>
-          <w:color w:val="000000"/>
-        </w:rPr>
-        <w:t xml:space="preserve"> некоторой угловой области поверхности, издали напоминающей угол чемодана (рис.21,22,23). Но это может быть и часть кузова автомобиля, например.</w:t>
+        <w:t>Рассматриваемая здесь ситуация – довольно распространена в промышленном дизайне. Название «угол чемодана» условно. Речь идет о выглаживании некоторой угловой области поверхности, издали напоминающей угол чемодана (рис.21,22,23). Но это может быть и часть кузова автомобиля, например.</w:t>
       </w:r>
     </w:p>
     <w:p>
@@ -17017,19 +16380,11 @@
           <w:color w:val="000000"/>
         </w:rPr>
       </w:pPr>
-      <w:proofErr w:type="gramStart"/>
-      <w:r>
-        <w:rPr>
-          <w:color w:val="000000"/>
-        </w:rPr>
-        <w:t>Далее  в</w:t>
-      </w:r>
-      <w:proofErr w:type="gramEnd"/>
-      <w:r>
-        <w:rPr>
-          <w:color w:val="000000"/>
-        </w:rPr>
-        <w:t xml:space="preserve"> рамках сглаженных и объединенных кривых, командой </w:t>
+      <w:r>
+        <w:rPr>
+          <w:color w:val="000000"/>
+        </w:rPr>
+        <w:t xml:space="preserve">Далее  в рамках сглаженных и объединенных кривых, командой </w:t>
       </w:r>
       <w:r>
         <w:rPr>
@@ -17095,21 +16450,7 @@
         <w:rPr>
           <w:color w:val="000000"/>
         </w:rPr>
-        <w:t xml:space="preserve">Полученная поверхность и так уже довольно гладкая. Но её можно </w:t>
-      </w:r>
-      <w:proofErr w:type="gramStart"/>
-      <w:r>
-        <w:rPr>
-          <w:color w:val="000000"/>
-        </w:rPr>
-        <w:t>ещё  улучшить</w:t>
-      </w:r>
-      <w:proofErr w:type="gramEnd"/>
-      <w:r>
-        <w:rPr>
-          <w:color w:val="000000"/>
-        </w:rPr>
-        <w:t xml:space="preserve">. Для этого примените команду </w:t>
+        <w:t xml:space="preserve">Полученная поверхность и так уже довольно гладкая. Но её можно ещё  улучшить. Для этого примените команду </w:t>
       </w:r>
       <w:r>
         <w:rPr>
@@ -17118,23 +16459,13 @@
         </w:rPr>
         <w:t xml:space="preserve">Изменить \ Поверхность \ </w:t>
       </w:r>
-      <w:proofErr w:type="spellStart"/>
       <w:r>
         <w:rPr>
           <w:b/>
           <w:i/>
           <w:color w:val="000000"/>
         </w:rPr>
-        <w:t>Выглаживание</w:t>
-      </w:r>
-      <w:proofErr w:type="spellEnd"/>
-      <w:r>
-        <w:rPr>
-          <w:b/>
-          <w:i/>
-          <w:color w:val="000000"/>
-        </w:rPr>
-        <w:t xml:space="preserve"> грани</w:t>
+        <w:t>Выглаживание грани</w:t>
       </w:r>
       <w:r>
         <w:rPr>
@@ -17174,37 +16505,13 @@
           <w:i/>
           <w:color w:val="000000"/>
         </w:rPr>
-        <w:t xml:space="preserve">Степень </w:t>
-      </w:r>
-      <w:proofErr w:type="gramStart"/>
-      <w:r>
-        <w:rPr>
-          <w:b/>
-          <w:i/>
-          <w:color w:val="000000"/>
-        </w:rPr>
-        <w:t>и  допуск</w:t>
-      </w:r>
-      <w:proofErr w:type="gramEnd"/>
-      <w:r>
-        <w:rPr>
-          <w:color w:val="000000"/>
-        </w:rPr>
-        <w:t xml:space="preserve"> (рис.18). Степень выглаженной кривой можете задать в пределах 3 – </w:t>
-      </w:r>
-      <w:proofErr w:type="gramStart"/>
-      <w:r>
-        <w:rPr>
-          <w:color w:val="000000"/>
-        </w:rPr>
-        <w:t>7,  а</w:t>
-      </w:r>
-      <w:proofErr w:type="gramEnd"/>
-      <w:r>
-        <w:rPr>
-          <w:color w:val="000000"/>
-        </w:rPr>
-        <w:t xml:space="preserve"> допуск укажите в  10 – 40 мм (рис.19). Вы имеете право несколько (в пределах 10-40 мм) отклониться от исходных поверхностей.</w:t>
+        <w:t>Степень и  допуск</w:t>
+      </w:r>
+      <w:r>
+        <w:rPr>
+          <w:color w:val="000000"/>
+        </w:rPr>
+        <w:t xml:space="preserve"> (рис.18). Степень выглаженной кривой можете задать в пределах 3 – 7,  а допуск укажите в  10 – 40 мм (рис.19). Вы имеете право несколько (в пределах 10-40 мм) отклониться от исходных поверхностей.</w:t>
       </w:r>
     </w:p>
     <w:p>
@@ -17513,7 +16820,6 @@
         </w:rPr>
         <w:t xml:space="preserve">Анализ \ Форма \ </w:t>
       </w:r>
-      <w:proofErr w:type="gramStart"/>
       <w:r>
         <w:rPr>
           <w:b/>
@@ -17526,14 +16832,7 @@
         <w:rPr>
           <w:color w:val="000000"/>
         </w:rPr>
-        <w:t>(</w:t>
-      </w:r>
-      <w:proofErr w:type="gramEnd"/>
-      <w:r>
-        <w:rPr>
-          <w:color w:val="000000"/>
-        </w:rPr>
-        <w:t>рис.20).</w:t>
+        <w:t>(рис.20).</w:t>
       </w:r>
     </w:p>
     <w:p>
@@ -18397,21 +17696,12 @@
         </w:rPr>
         <w:t xml:space="preserve">Итак, из директории </w:t>
       </w:r>
-      <w:proofErr w:type="spellStart"/>
       <w:r>
         <w:rPr>
           <w:i/>
           <w:color w:val="000000"/>
         </w:rPr>
-        <w:t>Prim</w:t>
-      </w:r>
-      <w:proofErr w:type="spellEnd"/>
-      <w:r>
-        <w:rPr>
-          <w:i/>
-          <w:color w:val="000000"/>
-        </w:rPr>
-        <w:t xml:space="preserve"> </w:t>
+        <w:t xml:space="preserve">Prim </w:t>
       </w:r>
       <w:r>
         <w:rPr>
@@ -18419,34 +17709,14 @@
         </w:rPr>
         <w:t xml:space="preserve">вызовите заготовку </w:t>
       </w:r>
-      <w:proofErr w:type="spellStart"/>
       <w:r>
         <w:rPr>
           <w:b/>
           <w:i/>
           <w:color w:val="000000"/>
         </w:rPr>
-        <w:t>AirPlane_Isch</w:t>
-      </w:r>
-      <w:proofErr w:type="spellEnd"/>
-      <w:r>
-        <w:rPr>
-          <w:b/>
-          <w:i/>
-          <w:color w:val="000000"/>
-        </w:rPr>
-        <w:t xml:space="preserve"> </w:t>
-      </w:r>
-      <w:proofErr w:type="spellStart"/>
-      <w:r>
-        <w:rPr>
-          <w:b/>
-          <w:i/>
-          <w:color w:val="000000"/>
-        </w:rPr>
-        <w:t>Pl.prt</w:t>
-      </w:r>
-      <w:proofErr w:type="spellEnd"/>
+        <w:t>AirPlane_Isch Pl.prt</w:t>
+      </w:r>
       <w:r>
         <w:rPr>
           <w:color w:val="000000"/>
@@ -19105,17 +18375,8 @@
           <w:b/>
           <w:color w:val="000000"/>
         </w:rPr>
-        <w:t xml:space="preserve">Верхний </w:t>
-      </w:r>
-      <w:proofErr w:type="spellStart"/>
-      <w:r>
-        <w:rPr>
-          <w:b/>
-          <w:color w:val="000000"/>
-        </w:rPr>
-        <w:t>батокс</w:t>
-      </w:r>
-      <w:proofErr w:type="spellEnd"/>
+        <w:t>Верхний батокс</w:t>
+      </w:r>
       <w:r>
         <w:rPr>
           <w:color w:val="000000"/>
@@ -20158,21 +19419,7 @@
         <w:rPr>
           <w:color w:val="000000"/>
         </w:rPr>
-        <w:t xml:space="preserve">В качестве направляющих кривых используем кривые «Максимальная полуширота» и «Нижний </w:t>
-      </w:r>
-      <w:proofErr w:type="spellStart"/>
-      <w:r>
-        <w:rPr>
-          <w:color w:val="000000"/>
-        </w:rPr>
-        <w:t>батокс</w:t>
-      </w:r>
-      <w:proofErr w:type="spellEnd"/>
-      <w:r>
-        <w:rPr>
-          <w:color w:val="000000"/>
-        </w:rPr>
-        <w:t xml:space="preserve">». </w:t>
+        <w:t xml:space="preserve">В качестве направляющих кривых используем кривые «Максимальная полуширота» и «Нижний батокс». </w:t>
       </w:r>
     </w:p>
     <w:p>
@@ -21676,16 +20923,8 @@
         <w:rPr>
           <w:color w:val="000000"/>
         </w:rPr>
-        <w:t>Опять начинаем с подготовительных построений. Сначала строим линию пересечения фюзеляжа и «Плоскости границы заборника» (рис.28</w:t>
-      </w:r>
-      <w:proofErr w:type="gramStart"/>
-      <w:r>
-        <w:rPr>
-          <w:color w:val="000000"/>
-        </w:rPr>
-        <w:t>) .</w:t>
-      </w:r>
-      <w:proofErr w:type="gramEnd"/>
+        <w:t>Опять начинаем с подготовительных построений. Сначала строим линию пересечения фюзеляжа и «Плоскости границы заборника» (рис.28).</w:t>
+      </w:r>
     </w:p>
     <w:p>
       <w:pPr>
@@ -21751,14 +20990,12 @@
         </w:rPr>
         <w:t xml:space="preserve">Следующим </w:t>
       </w:r>
-      <w:proofErr w:type="gramStart"/>
-      <w:r>
-        <w:rPr>
-          <w:color w:val="000000"/>
-        </w:rPr>
-        <w:t>шагом  мы</w:t>
-      </w:r>
-      <w:proofErr w:type="gramEnd"/>
+      <w:r>
+        <w:rPr>
+          <w:color w:val="000000"/>
+        </w:rPr>
+        <w:t>шагом мы</w:t>
+      </w:r>
       <w:r>
         <w:rPr>
           <w:color w:val="000000"/>
@@ -21838,14 +21075,12 @@
         </w:rPr>
         <w:t xml:space="preserve"> должно быть таким, как на рис.27. </w:t>
       </w:r>
-      <w:proofErr w:type="gramStart"/>
       <w:r>
         <w:rPr>
           <w:color w:val="000000"/>
         </w:rPr>
         <w:t>Переключатель</w:t>
       </w:r>
-      <w:proofErr w:type="gramEnd"/>
       <w:r>
         <w:rPr>
           <w:color w:val="000000"/>
@@ -22092,11 +21327,28 @@
           <w:color w:val="000000"/>
         </w:rPr>
       </w:pPr>
+    </w:p>
+    <w:p>
+      <w:pPr>
+        <w:pBdr>
+          <w:top w:val="nil"/>
+          <w:left w:val="nil"/>
+          <w:bottom w:val="nil"/>
+          <w:right w:val="nil"/>
+          <w:between w:val="nil"/>
+        </w:pBdr>
+        <w:spacing w:line="240" w:lineRule="auto"/>
+        <w:ind w:left="0" w:hanging="2"/>
+        <w:rPr>
+          <w:color w:val="000000"/>
+        </w:rPr>
+      </w:pPr>
       <w:r>
         <w:rPr>
           <w:noProof/>
           <w:color w:val="000000"/>
         </w:rPr>
+        <w:lastRenderedPageBreak/>
         <w:drawing>
           <wp:inline distT="0" distB="0" distL="114300" distR="114300" wp14:anchorId="3BA041CF" wp14:editId="0E096B2F">
             <wp:extent cx="2057400" cy="1276350"/>
@@ -23718,21 +22970,13 @@
         </w:rPr>
         <w:t xml:space="preserve">Плоскость входа </w:t>
       </w:r>
-      <w:proofErr w:type="gramStart"/>
       <w:r>
         <w:rPr>
           <w:i/>
           <w:color w:val="000000"/>
         </w:rPr>
-        <w:t xml:space="preserve">заборника  </w:t>
-      </w:r>
-      <w:r>
-        <w:rPr>
-          <w:color w:val="000000"/>
-        </w:rPr>
-        <w:t>(</w:t>
-      </w:r>
-      <w:proofErr w:type="gramEnd"/>
+        <w:t>заборника (</w:t>
+      </w:r>
       <w:r>
         <w:rPr>
           <w:color w:val="000000"/>
@@ -23823,7 +23067,21 @@
         <w:rPr>
           <w:color w:val="000000"/>
         </w:rPr>
-        <w:t>элементов  самолета</w:t>
+        <w:t>элементов</w:t>
+      </w:r>
+      <w:proofErr w:type="gramEnd"/>
+      <w:r>
+        <w:rPr>
+          <w:color w:val="000000"/>
+        </w:rPr>
+        <w:t xml:space="preserve"> </w:t>
+      </w:r>
+      <w:proofErr w:type="gramStart"/>
+      <w:r>
+        <w:rPr>
+          <w:color w:val="000000"/>
+        </w:rPr>
+        <w:t>самолета</w:t>
       </w:r>
       <w:proofErr w:type="gramEnd"/>
       <w:r>
@@ -24177,7 +23435,6 @@
         </w:rPr>
         <w:t xml:space="preserve">Загрузите пример </w:t>
       </w:r>
-      <w:proofErr w:type="spellStart"/>
       <w:r>
         <w:rPr>
           <w:b/>
@@ -24186,7 +23443,6 @@
         </w:rPr>
         <w:t>Tufly_Isch.prt</w:t>
       </w:r>
-      <w:proofErr w:type="spellEnd"/>
     </w:p>
     <w:p>
       <w:pPr>
@@ -28087,21 +27343,7 @@
         <w:rPr>
           <w:color w:val="000000"/>
         </w:rPr>
-        <w:t xml:space="preserve">Поставим на проекции кривой подошвы новые точки, и повторно проведем по ним два сплайна (рис.22). Нам важно разделить форму верхнего сечения каблука на три части: отрезок, и две </w:t>
-      </w:r>
-      <w:proofErr w:type="spellStart"/>
-      <w:r>
-        <w:rPr>
-          <w:color w:val="000000"/>
-        </w:rPr>
-        <w:t>полудуги</w:t>
-      </w:r>
-      <w:proofErr w:type="spellEnd"/>
-      <w:r>
-        <w:rPr>
-          <w:color w:val="000000"/>
-        </w:rPr>
-        <w:t>.</w:t>
+        <w:t>Поставим на проекции кривой подошвы новые точки, и повторно проведем по ним два сплайна (рис.22). Нам важно разделить форму верхнего сечения каблука на три части: отрезок, и две полудуги.</w:t>
       </w:r>
     </w:p>
     <w:p>
@@ -28189,21 +27431,7 @@
         <w:rPr>
           <w:color w:val="000000"/>
         </w:rPr>
-        <w:t xml:space="preserve">-х сегментов: отрезок, и две </w:t>
-      </w:r>
-      <w:proofErr w:type="spellStart"/>
-      <w:r>
-        <w:rPr>
-          <w:color w:val="000000"/>
-        </w:rPr>
-        <w:t>полудуги</w:t>
-      </w:r>
-      <w:proofErr w:type="spellEnd"/>
-      <w:r>
-        <w:rPr>
-          <w:color w:val="000000"/>
-        </w:rPr>
-        <w:t>.</w:t>
+        <w:t>-х сегментов: отрезок, и две полудуги.</w:t>
       </w:r>
     </w:p>
     <w:p>
@@ -28603,21 +27831,7 @@
         <w:rPr>
           <w:color w:val="000000"/>
         </w:rPr>
-        <w:t xml:space="preserve">-х сегментов: отрезок, и две </w:t>
-      </w:r>
-      <w:proofErr w:type="spellStart"/>
-      <w:r>
-        <w:rPr>
-          <w:color w:val="000000"/>
-        </w:rPr>
-        <w:t>полудуги</w:t>
-      </w:r>
-      <w:proofErr w:type="spellEnd"/>
-      <w:r>
-        <w:rPr>
-          <w:color w:val="000000"/>
-        </w:rPr>
-        <w:t>.</w:t>
+        <w:t>-х сегментов: отрезок, и две полудуги.</w:t>
       </w:r>
     </w:p>
     <w:p>
@@ -28643,21 +27857,7 @@
         <w:rPr>
           <w:color w:val="000000"/>
         </w:rPr>
-        <w:t xml:space="preserve">При этом для точного определения центра, и крайних точек </w:t>
-      </w:r>
-      <w:proofErr w:type="spellStart"/>
-      <w:r>
-        <w:rPr>
-          <w:color w:val="000000"/>
-        </w:rPr>
-        <w:t>полудуг</w:t>
-      </w:r>
-      <w:proofErr w:type="spellEnd"/>
-      <w:r>
-        <w:rPr>
-          <w:color w:val="000000"/>
-        </w:rPr>
-        <w:t>, активно используем способ построения точек относительно предварительно указанной точки.</w:t>
+        <w:t>При этом для точного определения центра, и крайних точек полудуг, активно используем способ построения точек относительно предварительно указанной точки.</w:t>
       </w:r>
     </w:p>
     <w:p>
@@ -29380,21 +28580,7 @@
         <w:rPr>
           <w:color w:val="000000"/>
         </w:rPr>
-        <w:t xml:space="preserve">В этом задании студент должен самостоятельно выбрать несложный сборочный узел из своего обихода. Это может быть мясорубка, </w:t>
-      </w:r>
-      <w:proofErr w:type="spellStart"/>
-      <w:r>
-        <w:rPr>
-          <w:color w:val="000000"/>
-        </w:rPr>
-        <w:t>скэйборд</w:t>
-      </w:r>
-      <w:proofErr w:type="spellEnd"/>
-      <w:r>
-        <w:rPr>
-          <w:color w:val="000000"/>
-        </w:rPr>
-        <w:t xml:space="preserve">, механизм для заточки карандашей, игрушечный автомобиль, кофемолка и др. Число деталей в этом механизме не должно превышать 5 – 8. Мелкими деталями и элементами крепежа можно пренебречь. Важно, чтобы этот механизм можно было взять в руки и обмерить его детали. </w:t>
+        <w:t xml:space="preserve">В этом задании студент должен самостоятельно выбрать несложный сборочный узел из своего обихода. Это может быть мясорубка, скэйборд, механизм для заточки карандашей, игрушечный автомобиль, кофемолка и др. Число деталей в этом механизме не должно превышать 5 – 8. Мелкими деталями и элементами крепежа можно пренебречь. Важно, чтобы этот механизм можно было взять в руки и обмерить его детали. </w:t>
       </w:r>
     </w:p>
     <w:p>

</xml_diff>